<commit_message>
x-trusted-cluster: 1 new trusted-x candidate (Midhani), 2 new trusted-x-watch names (Elecon Engineering, Titagarh Rail Systems), 1 trusted_signals refresh (Sambhv Steel Tubes)
Co-Authored-By: Claude Sonnet 5 <noreply@anthropic.com>
</commit_message>
<xml_diff>
--- a/projects/valuepickr-open-screen/docs/Sambhv Steel Tubes.docx
+++ b/projects/valuepickr-open-screen/docs/Sambhv Steel Tubes.docx
@@ -2912,6 +2912,38 @@
           <w:szCs w:val="18"/>
         </w:rPr>
         <w:t xml:space="preserve">Every time a trusted user expresses clear conviction on this stock, most recent first — this section accumulates over time, it isn't a one-time snapshot.</w:t>
+      </w:r>
+    </w:p>
+    <w:p>
+      <w:pPr>
+        <w:spacing w:after="100"/>
+      </w:pPr>
+      <w:r>
+        <w:rPr>
+          <w:b/>
+          <w:bCs/>
+          <w:sz w:val="20"/>
+          <w:szCs w:val="20"/>
+        </w:rPr>
+        <w:t xml:space="preserve">2026-09-24 — suru27 (X)</w:t>
+      </w:r>
+      <w:r>
+        <w:rPr>
+          <w:i/>
+          <w:iCs/>
+          <w:color w:val="666666"/>
+          <w:sz w:val="18"/>
+          <w:szCs w:val="18"/>
+        </w:rPr>
+        <w:t xml:space="preserve"> (X / @suru27)</w:t>
+      </w:r>
+      <w:r>
+        <w:rPr>
+          <w:sz w:val="20"/>
+          <w:szCs w:val="20"/>
+        </w:rPr>
+        <w:br/>
+        <w:t xml:space="preserve">: Dedicated writeup on stainless CR coil pivot: absent from FY24 mix, ~26% of FY26 finished-goods sales by value; INR 810 Cr greenfield Phase-I at Kesda for stainless capacity.</w:t>
       </w:r>
     </w:p>
     <w:p>

</xml_diff>